<commit_message>
Fix evidence discipline and GitHub URL in SUMMARY
Evidence discipline corrections (A- → A):
- Changed 'proof that' to 'demonstrates that' or 'illustrates that' (5 instances)
- Changed 'proves that' to 'demonstrates that' (2 instances)
- Changed 'CIF stands.' to 'This case supports CIF's central claim:'
- Historical case studies support/refine/illustrate CIF; they cannot formally prove the whole framework

GitHub URL correction:
- Fixed repository path from derekjhone → derekhone (canonical account)

Academic rigor upgrade per user feedback.
</commit_message>
<xml_diff>
--- a/SUMMARY.docx
+++ b/SUMMARY.docx
@@ -4158,7 +4158,7 @@
         <w:t xml:space="preserve"> </w:t>
       </w:r>
       <w:r>
-        <w:t xml:space="preserve">The Late Bronze Age Collapse is proof that when the network is the system, and the network collapses, the system dies — even if fragments of the data survive. A system optimized for efficiency over resilience, that locks specialized knowledge to a single institutional context, is catastrophically fragile. It works brilliantly until it doesn’t. And when it fails, it fails completely. The Greek Dark Ages demonstrate that recovery after such collapse is not a</w:t>
+        <w:t xml:space="preserve">The Late Bronze Age Collapse demonstrates that when the network is the system, and the network collapses, the system dies — even if fragments of the data survive. A system optimized for efficiency over resilience, that locks specialized knowledge to a single institutional context, is catastrophically fragile. It works brilliantly until it doesn’t. And when it fails, it fails completely. The Greek Dark Ages demonstrate that recovery after such collapse is not a</w:t>
       </w:r>
       <w:r>
         <w:t xml:space="preserve"> </w:t>
@@ -6123,7 +6123,7 @@
         <w:t xml:space="preserve"> </w:t>
       </w:r>
       <w:r>
-        <w:t xml:space="preserve">Polynesian navigation proves that</w:t>
+        <w:t xml:space="preserve">Polynesian navigation demonstrates that</w:t>
       </w:r>
       <w:r>
         <w:t xml:space="preserve"> </w:t>
@@ -7079,7 +7079,7 @@
         </w:numPr>
       </w:pPr>
       <w:r>
-        <w:t xml:space="preserve">Göbekli Tepe proves that</w:t>
+        <w:t xml:space="preserve">Göbekli Tepe demonstrates that</w:t>
       </w:r>
       <w:r>
         <w:t xml:space="preserve"> </w:t>
@@ -7195,7 +7195,7 @@
         <w:t xml:space="preserve"> </w:t>
       </w:r>
       <w:r>
-        <w:t xml:space="preserve">Göbekli Tepe is proof that you do not need writing, cities, or kings to transmit complex knowledge across centuries —</w:t>
+        <w:t xml:space="preserve">Göbekli Tepe demonstrates that you do not need writing, cities, or kings to transmit complex knowledge across centuries —</w:t>
       </w:r>
       <w:r>
         <w:t xml:space="preserve"> </w:t>
@@ -8623,7 +8623,7 @@
         <w:t xml:space="preserve">the reader is dead, the language is extinct, and the cultural key is gone</w:t>
       </w:r>
       <w:r>
-        <w:t xml:space="preserve">. CIF stands.</w:t>
+        <w:t xml:space="preserve">. This case supports CIF’s central claim:</w:t>
       </w:r>
       <w:r>
         <w:t xml:space="preserve"> </w:t>
@@ -8802,7 +8802,7 @@
         <w:t xml:space="preserve">Undeciphered scripts</w:t>
       </w:r>
       <w:r>
-        <w:t xml:space="preserve">: The purest proof that data (Pillars 1–2) without semantic continuity (Pillar 5) is not inheritance. Perfect data preservation + lost reader = unreadable noise.</w:t>
+        <w:t xml:space="preserve">: The clearest illustration that data (Pillars 1–2) without semantic continuity (Pillar 5) is not inheritance. Perfect data preservation + lost reader = unreadable noise.</w:t>
       </w:r>
     </w:p>
     <w:bookmarkEnd w:id="56"/>
@@ -10046,7 +10046,7 @@
           <w:rPr>
             <w:rStyle w:val="Hyperlink"/>
           </w:rPr>
-          <w:t xml:space="preserve">github.com/derekjhone/cif-giza-transmission</w:t>
+          <w:t xml:space="preserve">github.com/derekhone/cif-giza-transmission</w:t>
         </w:r>
       </w:hyperlink>
       <w:r>

</xml_diff>

<commit_message>
Regenerate SUMMARY.pdf and SUMMARY.docx with corrected v2.0.1 DOI
The PDF/DOCX were stale after the DOI wire-in; regenerated so the exported
documents match SUMMARY.md (version DOI 10.5281/zenodo.21629986).
</commit_message>
<xml_diff>
--- a/SUMMARY.docx
+++ b/SUMMARY.docx
@@ -61,7 +61,7 @@
           <w:rPr>
             <w:rStyle w:val="Hyperlink"/>
           </w:rPr>
-          <w:t xml:space="preserve">10.5281/zenodo.21628073</w:t>
+          <w:t xml:space="preserve">10.5281/zenodo.21629986</w:t>
         </w:r>
       </w:hyperlink>
       <w:r>
@@ -9998,7 +9998,7 @@
           <w:rPr>
             <w:rStyle w:val="Hyperlink"/>
           </w:rPr>
-          <w:t xml:space="preserve">10.5281/zenodo.21628073</w:t>
+          <w:t xml:space="preserve">10.5281/zenodo.21629986</w:t>
         </w:r>
       </w:hyperlink>
       <w:r>

</xml_diff>

<commit_message>
Release v2.0.2 - clean source archive of non-content platform file
Bumps version to 2.0.2 and wires in new Zenodo version DOI
(10.5281/zenodo.21630213). The Zenodo source archive is rebuilt without
the non-content platform system file that was visible in the archive
listing. No changes to intellectual content vs 2.0.1.
</commit_message>
<xml_diff>
--- a/SUMMARY.docx
+++ b/SUMMARY.docx
@@ -61,7 +61,7 @@
           <w:rPr>
             <w:rStyle w:val="Hyperlink"/>
           </w:rPr>
-          <w:t xml:space="preserve">10.5281/zenodo.21629986</w:t>
+          <w:t xml:space="preserve">10.5281/zenodo.21630213</w:t>
         </w:r>
       </w:hyperlink>
       <w:r>
@@ -9998,7 +9998,7 @@
           <w:rPr>
             <w:rStyle w:val="Hyperlink"/>
           </w:rPr>
-          <w:t xml:space="preserve">10.5281/zenodo.21629986</w:t>
+          <w:t xml:space="preserve">10.5281/zenodo.21630213</w:t>
         </w:r>
       </w:hyperlink>
       <w:r>

</xml_diff>